<commit_message>
Ajustes no cadastro de beneficiário.
</commit_message>
<xml_diff>
--- a/Implementação_CPF_Cliente_Beneficiario.docx
+++ b/Implementação_CPF_Cliente_Beneficiario.docx
@@ -86,20 +86,12 @@
       </w:r>
     </w:p>
     <w:p>
-      <w:pPr>
-        <w:pStyle w:val="PargrafodaLista"/>
-      </w:pPr>
-    </w:p>
-    <w:p>
-      <w:r>
-        <w:rPr>
-          <w:noProof/>
-        </w:rPr>
+      <w:r>
         <w:drawing>
-          <wp:inline distT="0" distB="0" distL="0" distR="0" wp14:anchorId="3AE03BCA" wp14:editId="732C2B3A">
-            <wp:extent cx="5400040" cy="2921635"/>
-            <wp:effectExtent l="0" t="0" r="0" b="0"/>
-            <wp:docPr id="184152773" name="Imagem 1"/>
+          <wp:inline distT="0" distB="0" distL="0" distR="0" wp14:anchorId="33BC6FF8" wp14:editId="5DC27118">
+            <wp:extent cx="5400040" cy="2924810"/>
+            <wp:effectExtent l="0" t="0" r="0" b="8890"/>
+            <wp:docPr id="409162117" name="Imagem 1"/>
             <wp:cNvGraphicFramePr>
               <a:graphicFrameLocks xmlns:a="http://schemas.openxmlformats.org/drawingml/2006/main" noChangeAspect="1"/>
             </wp:cNvGraphicFramePr>
@@ -107,7 +99,7 @@
               <a:graphicData uri="http://schemas.openxmlformats.org/drawingml/2006/picture">
                 <pic:pic xmlns:pic="http://schemas.openxmlformats.org/drawingml/2006/picture">
                   <pic:nvPicPr>
-                    <pic:cNvPr id="184152773" name=""/>
+                    <pic:cNvPr id="409162117" name=""/>
                     <pic:cNvPicPr/>
                   </pic:nvPicPr>
                   <pic:blipFill>
@@ -119,7 +111,7 @@
                   <pic:spPr>
                     <a:xfrm>
                       <a:off x="0" y="0"/>
-                      <a:ext cx="5400040" cy="2921635"/>
+                      <a:ext cx="5400040" cy="2924810"/>
                     </a:xfrm>
                     <a:prstGeom prst="rect">
                       <a:avLst/>
@@ -134,54 +126,23 @@
     </w:p>
     <w:p>
       <w:r>
-        <w:t>Funcionamento do botão BENEFICIÁRIOS</w:t>
-      </w:r>
-    </w:p>
-    <w:p>
-      <w:pPr>
-        <w:pStyle w:val="PargrafodaLista"/>
-        <w:numPr>
-          <w:ilvl w:val="0"/>
-          <w:numId w:val="4"/>
-        </w:numPr>
-      </w:pPr>
-      <w:r>
-        <w:t>No momento do cadastro do cliente o botão estará desabilitado. Assim que o usuário cadastrar o CLIENTE e</w:t>
-      </w:r>
-      <w:r>
-        <w:t xml:space="preserve"> receber a mensagem “Cadastro efetuado com sucesso”, a tela é redirecionada para ALTERAR CLIENTE e com o botão habilitado</w:t>
-      </w:r>
-    </w:p>
-    <w:p>
-      <w:pPr>
-        <w:pStyle w:val="PargrafodaLista"/>
-        <w:numPr>
-          <w:ilvl w:val="0"/>
-          <w:numId w:val="4"/>
-        </w:numPr>
-      </w:pPr>
+        <w:t>Botão</w:t>
+      </w:r>
+      <w:r>
+        <w:t xml:space="preserve"> BENEFICIÁRIOS</w:t>
+      </w:r>
+      <w:r>
+        <w:br/>
+      </w:r>
       <w:r>
         <w:t>Ao clicar no botão, abrirá o pop-up para inclusão do CPF de um beneficiário ao CLIENTE</w:t>
       </w:r>
-    </w:p>
-    <w:p>
-      <w:pPr>
-        <w:pStyle w:val="PargrafodaLista"/>
-        <w:numPr>
-          <w:ilvl w:val="0"/>
-          <w:numId w:val="4"/>
-        </w:numPr>
-      </w:pPr>
-      <w:r>
-        <w:lastRenderedPageBreak/>
-        <w:t>Tela para inclusão do beneficiário</w:t>
-      </w:r>
       <w:r>
         <w:drawing>
-          <wp:inline distT="0" distB="0" distL="0" distR="0" wp14:anchorId="740C82E7" wp14:editId="5DCBD8FD">
-            <wp:extent cx="5400040" cy="3223260"/>
-            <wp:effectExtent l="0" t="0" r="0" b="0"/>
-            <wp:docPr id="806636481" name="Imagem 1"/>
+          <wp:inline distT="0" distB="0" distL="0" distR="0" wp14:anchorId="54E1579C" wp14:editId="04AA1355">
+            <wp:extent cx="5400040" cy="3268345"/>
+            <wp:effectExtent l="0" t="0" r="0" b="8255"/>
+            <wp:docPr id="1652992518" name="Imagem 1"/>
             <wp:cNvGraphicFramePr>
               <a:graphicFrameLocks xmlns:a="http://schemas.openxmlformats.org/drawingml/2006/main" noChangeAspect="1"/>
             </wp:cNvGraphicFramePr>
@@ -189,7 +150,7 @@
               <a:graphicData uri="http://schemas.openxmlformats.org/drawingml/2006/picture">
                 <pic:pic xmlns:pic="http://schemas.openxmlformats.org/drawingml/2006/picture">
                   <pic:nvPicPr>
-                    <pic:cNvPr id="806636481" name=""/>
+                    <pic:cNvPr id="1652992518" name=""/>
                     <pic:cNvPicPr/>
                   </pic:nvPicPr>
                   <pic:blipFill>
@@ -201,7 +162,7 @@
                   <pic:spPr>
                     <a:xfrm>
                       <a:off x="0" y="0"/>
-                      <a:ext cx="5400040" cy="3223260"/>
+                      <a:ext cx="5400040" cy="3268345"/>
                     </a:xfrm>
                     <a:prstGeom prst="rect">
                       <a:avLst/>
@@ -223,6 +184,7 @@
         </w:numPr>
       </w:pPr>
       <w:r>
+        <w:lastRenderedPageBreak/>
         <w:t>Campo CPF obrigatório</w:t>
       </w:r>
     </w:p>
@@ -298,14 +260,19 @@
         <w:t>modificado</w:t>
       </w:r>
       <w:r>
-        <w:t xml:space="preserve"> para Salvar</w:t>
-      </w:r>
+        <w:t xml:space="preserve"> </w:t>
+      </w:r>
+      <w:proofErr w:type="gramStart"/>
+      <w:r>
+        <w:t>para Salvar</w:t>
+      </w:r>
+      <w:proofErr w:type="gramEnd"/>
       <w:r>
         <w:drawing>
-          <wp:inline distT="0" distB="0" distL="0" distR="0" wp14:anchorId="1CE93BB0" wp14:editId="6C712035">
-            <wp:extent cx="5400040" cy="3255645"/>
+          <wp:inline distT="0" distB="0" distL="0" distR="0" wp14:anchorId="6BE8521A" wp14:editId="34E4CA34">
+            <wp:extent cx="5400040" cy="3293745"/>
             <wp:effectExtent l="0" t="0" r="0" b="1905"/>
-            <wp:docPr id="1287672674" name="Imagem 1"/>
+            <wp:docPr id="784236661" name="Imagem 1"/>
             <wp:cNvGraphicFramePr>
               <a:graphicFrameLocks xmlns:a="http://schemas.openxmlformats.org/drawingml/2006/main" noChangeAspect="1"/>
             </wp:cNvGraphicFramePr>
@@ -313,7 +280,7 @@
               <a:graphicData uri="http://schemas.openxmlformats.org/drawingml/2006/picture">
                 <pic:pic xmlns:pic="http://schemas.openxmlformats.org/drawingml/2006/picture">
                   <pic:nvPicPr>
-                    <pic:cNvPr id="1287672674" name=""/>
+                    <pic:cNvPr id="784236661" name=""/>
                     <pic:cNvPicPr/>
                   </pic:nvPicPr>
                   <pic:blipFill>
@@ -325,7 +292,7 @@
                   <pic:spPr>
                     <a:xfrm>
                       <a:off x="0" y="0"/>
-                      <a:ext cx="5400040" cy="3255645"/>
+                      <a:ext cx="5400040" cy="3293745"/>
                     </a:xfrm>
                     <a:prstGeom prst="rect">
                       <a:avLst/>
@@ -337,18 +304,12 @@
           </wp:inline>
         </w:drawing>
       </w:r>
-    </w:p>
-    <w:p>
-      <w:pPr>
-        <w:pStyle w:val="PargrafodaLista"/>
-      </w:pPr>
-      <w:r>
-        <w:lastRenderedPageBreak/>
+      <w:r>
         <w:drawing>
-          <wp:inline distT="0" distB="0" distL="0" distR="0" wp14:anchorId="1EBCA2F5" wp14:editId="588F36F9">
-            <wp:extent cx="5400040" cy="3220085"/>
-            <wp:effectExtent l="0" t="0" r="0" b="0"/>
-            <wp:docPr id="2076250975" name="Imagem 1"/>
+          <wp:inline distT="0" distB="0" distL="0" distR="0" wp14:anchorId="5D804927" wp14:editId="55A32B74">
+            <wp:extent cx="5400040" cy="3290570"/>
+            <wp:effectExtent l="0" t="0" r="0" b="5080"/>
+            <wp:docPr id="1329007307" name="Imagem 1"/>
             <wp:cNvGraphicFramePr>
               <a:graphicFrameLocks xmlns:a="http://schemas.openxmlformats.org/drawingml/2006/main" noChangeAspect="1"/>
             </wp:cNvGraphicFramePr>
@@ -356,7 +317,7 @@
               <a:graphicData uri="http://schemas.openxmlformats.org/drawingml/2006/picture">
                 <pic:pic xmlns:pic="http://schemas.openxmlformats.org/drawingml/2006/picture">
                   <pic:nvPicPr>
-                    <pic:cNvPr id="2076250975" name=""/>
+                    <pic:cNvPr id="1329007307" name=""/>
                     <pic:cNvPicPr/>
                   </pic:nvPicPr>
                   <pic:blipFill>
@@ -368,7 +329,7 @@
                   <pic:spPr>
                     <a:xfrm>
                       <a:off x="0" y="0"/>
-                      <a:ext cx="5400040" cy="3220085"/>
+                      <a:ext cx="5400040" cy="3290570"/>
                     </a:xfrm>
                     <a:prstGeom prst="rect">
                       <a:avLst/>
@@ -381,6 +342,49 @@
         </w:drawing>
       </w:r>
     </w:p>
+    <w:p>
+      <w:pPr>
+        <w:pStyle w:val="PargrafodaLista"/>
+      </w:pPr>
+      <w:r>
+        <w:lastRenderedPageBreak/>
+        <w:drawing>
+          <wp:inline distT="0" distB="0" distL="0" distR="0" wp14:anchorId="5364BAF1" wp14:editId="60781F07">
+            <wp:extent cx="5400040" cy="3272155"/>
+            <wp:effectExtent l="0" t="0" r="0" b="4445"/>
+            <wp:docPr id="342203655" name="Imagem 1"/>
+            <wp:cNvGraphicFramePr>
+              <a:graphicFrameLocks xmlns:a="http://schemas.openxmlformats.org/drawingml/2006/main" noChangeAspect="1"/>
+            </wp:cNvGraphicFramePr>
+            <a:graphic xmlns:a="http://schemas.openxmlformats.org/drawingml/2006/main">
+              <a:graphicData uri="http://schemas.openxmlformats.org/drawingml/2006/picture">
+                <pic:pic xmlns:pic="http://schemas.openxmlformats.org/drawingml/2006/picture">
+                  <pic:nvPicPr>
+                    <pic:cNvPr id="342203655" name=""/>
+                    <pic:cNvPicPr/>
+                  </pic:nvPicPr>
+                  <pic:blipFill>
+                    <a:blip r:embed="rId9"/>
+                    <a:stretch>
+                      <a:fillRect/>
+                    </a:stretch>
+                  </pic:blipFill>
+                  <pic:spPr>
+                    <a:xfrm>
+                      <a:off x="0" y="0"/>
+                      <a:ext cx="5400040" cy="3272155"/>
+                    </a:xfrm>
+                    <a:prstGeom prst="rect">
+                      <a:avLst/>
+                    </a:prstGeom>
+                  </pic:spPr>
+                </pic:pic>
+              </a:graphicData>
+            </a:graphic>
+          </wp:inline>
+        </w:drawing>
+      </w:r>
+    </w:p>
     <w:p/>
     <w:p>
       <w:r>
@@ -421,22 +425,11 @@
       </w:pPr>
       <w:proofErr w:type="spellStart"/>
       <w:r>
-        <w:t>FI_SP_</w:t>
-      </w:r>
-      <w:proofErr w:type="gramStart"/>
-      <w:r>
-        <w:t>AltBenef</w:t>
+        <w:t>FI_SP_AltBenef</w:t>
       </w:r>
       <w:proofErr w:type="spellEnd"/>
       <w:r>
-        <w:t xml:space="preserve"> </w:t>
-      </w:r>
-      <w:r>
-        <w:t>:</w:t>
-      </w:r>
-      <w:proofErr w:type="gramEnd"/>
-      <w:r>
-        <w:t xml:space="preserve"> alterado o nome para </w:t>
+        <w:t xml:space="preserve">: alterado o nome para </w:t>
       </w:r>
       <w:proofErr w:type="spellStart"/>
       <w:r>
@@ -566,10 +559,7 @@
       </w:r>
       <w:proofErr w:type="spellEnd"/>
       <w:r>
-        <w:t xml:space="preserve">: </w:t>
-      </w:r>
-      <w:r>
-        <w:t>retornar a coluna CPF</w:t>
+        <w:t>: retornar a coluna CPF</w:t>
       </w:r>
     </w:p>
     <w:p>
@@ -1878,6 +1868,7 @@
   <w:style w:type="character" w:default="1" w:styleId="Fontepargpadro">
     <w:name w:val="Default Paragraph Font"/>
     <w:uiPriority w:val="1"/>
+    <w:semiHidden/>
     <w:unhideWhenUsed/>
   </w:style>
   <w:style w:type="table" w:default="1" w:styleId="Tabelanormal">

</xml_diff>